<commit_message>
bpb-sct-vn: bản in cuối bài phát biểu BCH 28/10 (soát lỗi bản Giám đốc, một câu chốt) thay file gd-duyet; reference ghi lỗi soát được và chỗ chỉnh
Co-Authored-By: Claude Fable 5.1 <noreply@anthropic.com>
Claude-Session: https://claude.ai/code/session_01H7QU2F3W63CLMpeCgUioam
</commit_message>
<xml_diff>
--- a/bpb-sct-vn/skills/bpb-sct-vn/kho-bai-mau/bpb-bch-dang-bo-tinh-2026-10-28-khu-cum-cong-nghiep-gd-duyet.docx
+++ b/bpb-sct-vn/skills/bpb-sct-vn/kho-bai-mau/bpb-bch-dang-bo-tinh-2026-10-28-khu-cum-cong-nghiep-gd-duyet.docx
@@ -147,7 +147,7 @@
           <w:i w:val="0"/>
           <w:sz w:val="30"/>
         </w:rPr>
-        <w:t>Chủ tịch Ủy ban nhân dân tỉnh đã thành lập 02 Ban Chỉ đạo phát triển khu công nghiệp tại các Quyết định số 2029/QĐ-UBND và số 2030/QĐ-UBND ngày 10/6/2026, do hai đồng chí Phó Chủ tịch Ủy ban nhân dân tỉnh (Nguyễn Thành Sinh, Phan Trung Bá) làm Trưởng ban, Ban Quản lý Khu kinh tế tỉnh là cơ quan thường trực.</w:t>
+        <w:t>Chủ tịch Ủy ban nhân dân tỉnh đã thành lập 02 Ban Chỉ đạo phát triển khu công nghiệp tại các Quyết định số 2029/QĐ-UBND và số 2030/QĐ-UBND ngày 10/6/2026, do hai đồng chí Phó Chủ tịch Ủy ban nhân dân tỉnh Nguyễn Thành Sinh và Phan Trung Bá làm Trưởng ban, Ban Quản lý Khu kinh tế tỉnh là cơ quan thường trực.</w:t>
       </w:r>
     </w:p>
     <w:p>
@@ -224,7 +224,7 @@
           <w:i w:val="0"/>
           <w:sz w:val="30"/>
         </w:rPr>
-        <w:t>Nhóm này đang tạo ra phần lớn giá trị sản xuất công nghiệp của tỉnh và quyết định sản lượng hai tháng cuối năm: tại Tằng Loỏng, axit photphoric mới đạt 39%, phân DAP mới đạt 62,9% kế hoạch năm. Vướng mắc của nhóm này là hạ tầng chưa đồng bộ, môi trường và các tồn tại kéo dài:</w:t>
+        <w:t>Nhóm này đang tạo ra phần lớn giá trị sản xuất công nghiệp của tỉnh và quyết định sản lượng hai tháng cuối năm: tại Tằng Loỏng, axit photphoric mới đạt 39%, phân DAP mới đạt 62,9% kế hoạch năm. Vướng mắc của nhóm này là hạ tầng chưa đồng bộ, áp lực về môi trường và các tồn tại kéo dài:</w:t>
       </w:r>
     </w:p>
     <w:p>
@@ -254,7 +254,22 @@
           <w:i w:val="0"/>
           <w:sz w:val="30"/>
         </w:rPr>
-        <w:t>- Đề án chuyển đổi Khu công nghiệp Tằng Loỏng sang khu công nghiệp sinh thái, xây dựng đã hơn 01 năm, qua 03 lần trình; Phó Chủ tịch Thường trực Ủy ban nhân dân tỉnh đã kết luận tại Thông báo số 192/TB-VPUBND ngày 28/10/2026: chuyển đổi là yêu cầu bắt buộc, Đề án phải có nhiệm vụ cụ thể, có địa chỉ, có thời hạn, hoàn thiện trong tháng 12/2026; dự án di chuyển dân cư ra khỏi ranh giới khu công nghiệp chưa được quyết định. Khu công nghiệp Đông Phố Mới phải có hạ tầng Cụm công nghiệp Bát Xát tại khu vực Bản Qua thì mới di dời được các cơ sở sản xuất theo lộ trình.</w:t>
+        <w:t>- Đề án chuyển đổi Khu công nghiệp Tằng Loỏng sang khu công nghiệp sinh thái, xây dựng đã hơn 01 năm, qua 03 lần trình; Phó Chủ tịch Thường trực Ủy ban nhân dân tỉnh đã kết luận tại Thông báo số 192/TB-VPUBND ngày 28/10/2026: chuyển đổi là yêu cầu bắt buộc, Đề án phải có nhiệm vụ cụ thể, có địa chỉ, có thời hạn, hoàn thiện trong tháng 12/2026; dự án di chuyển dân cư ra khỏi ranh giới khu công nghiệp chưa được quyết định.</w:t>
+      </w:r>
+    </w:p>
+    <w:p>
+      <w:pPr>
+        <w:ind w:firstLine="720"/>
+        <w:jc w:val="both"/>
+      </w:pPr>
+      <w:r>
+        <w:rPr>
+          <w:rFonts w:ascii="Times New Roman" w:hAnsi="Times New Roman" w:eastAsia="Times New Roman"/>
+          <w:b w:val="0"/>
+          <w:i w:val="0"/>
+          <w:sz w:val="30"/>
+        </w:rPr>
+        <w:t>- Khu công nghiệp Đông Phố Mới chỉ di dời được các cơ sở sản xuất theo lộ trình khi có hạ tầng Cụm công nghiệp Bát Xát tại khu vực Bản Qua.</w:t>
       </w:r>
     </w:p>
     <w:p>
@@ -384,7 +399,7 @@
           <w:i w:val="0"/>
           <w:sz w:val="30"/>
         </w:rPr>
-        <w:t xml:space="preserve"> Khu tái định cư Phú Xuân (Quyết định số 3105/QĐ-UBND ngày 27/8/2026) chưa xây dựng xong; khu tái định cư Khu công nghiệp Võ Lao chưa có chủ trương đầu tư; Khu công nghiệp Bản Qua chưa có khu tái định cư; Khu công nghiệp Cam Đường cần 212 lô. Chưa có đất tái định cư thì dân chưa thể bàn giao mặt bằng.</w:t>
+        <w:t xml:space="preserve"> Khu tái định cư Phú Xuân (Quyết định số 3105/QĐ-UBND ngày 27/8/2026) chưa xây dựng xong; khu tái định cư Khu công nghiệp Võ Lao chưa có chủ trương đầu tư; Khu công nghiệp Bản Qua chưa có khu tái định cư; Khu công nghiệp Cam Đường cần 212 lô. Chưa có đất tái định cư thì người dân chưa thể bàn giao mặt bằng.</w:t>
       </w:r>
     </w:p>
     <w:p>
@@ -503,7 +518,7 @@
           <w:i w:val="0"/>
           <w:sz w:val="30"/>
         </w:rPr>
-        <w:t>Cụm công nghiệp Thống Nhất 1 (74,95 ha) khởi công ngày 07/5/2026, đã chi trả 142/144 hộ, đang thi công hạ tầng. Các Cụm công nghiệp Phú Thịnh 1, Phú Thịnh 2, Phú Thịnh 3 có một vướng mắc chung là 72,23 ha đất Chè Văn Hưng tồn tại từ năm 2016; Phú Thịnh 3 đã khởi công ngày 16/7/2026. Cụm công nghiệp Mông Sơn (50 ha) thành lập tại Quyết định số 3426/QĐ-UBND ngày 23/9/2026. Tại xã Xuân Ái còn có các Cụm công nghiệp Yên Hợp 2 (75 ha, Quyết định số 3427/QĐ-UBND ngày 23/9/2026) và Xuân Ái (75 ha, Quyết định số 3865/QĐ-UBND ngày 17/10/2026) mới thành lập, cần chuẩn bị sớm mặt bằng.</w:t>
+        <w:t>Cụm công nghiệp Thống Nhất 1 (74,95 ha) khởi công ngày 07/5/2026, đã chi trả 142/144 hộ, đang thi công hạ tầng. Các Cụm công nghiệp Phú Thịnh 1, Phú Thịnh 2, Phú Thịnh 3 có một vướng mắc chung là 72,23 ha đất Chè Văn Hưng tồn tại từ năm 2016; Phú Thịnh 3 đã khởi công ngày 16/7/2026. Cụm công nghiệp Mông Sơn (50 ha) thành lập tại Quyết định số 3426/QĐ-UBND ngày 23/9/2026. Tại xã Xuân Ái còn có các Cụm công nghiệp Yên Hợp 2 (75 ha, Quyết định số 3427/QĐ-UBND ngày 23/9/2026) và Xuân Ái (75 ha, Quyết định số 3865/QĐ-UBND ngày 17/10/2026) mới thành lập, cần chuẩn bị mặt bằng ngay từ bây giờ.</w:t>
       </w:r>
     </w:p>
     <w:p>
@@ -518,7 +533,7 @@
           <w:i w:val="0"/>
           <w:sz w:val="30"/>
         </w:rPr>
-        <w:t>Vướng mắc lớn nhất ở các cụm là xác định nguồn gốc đất, đối tượng được bồi thường; riêng đất Chè Văn Hưng chưa xong thì cả ba Cụm công nghiệp Phú Thịnh 1, Phú Thịnh 2, Phú Thịnh 3 đều không triển khai được. Về hạ tầng: hai tuyến đường IC18 và Quốc lộ 4E vào Thống Nhất 1 đã phê duyệt dự án nhưng chưa khởi công, tuyến IC18 còn thiếu khoảng 50 tỷ đồng; đường vào và khu tái định cư Mông Sơn chưa có chủ trương đầu tư; khu vực Cam Đường - Gia Phú chưa có dự án cấp nước; Trạm biến áp 110 kV Thống Nhất 1 chưa có trong kế hoạch đầu tư.</w:t>
+        <w:t>Vướng mắc lớn nhất ở các cụm là xác định nguồn gốc đất, đối tượng được bồi thường; riêng 72,23 ha đất Chè Văn Hưng chưa xử lý xong thì cả ba Cụm công nghiệp Phú Thịnh 1, Phú Thịnh 2, Phú Thịnh 3 đều không thể triển khai. Về hạ tầng: hai tuyến đường IC18 và Quốc lộ 4E vào Thống Nhất 1 đã phê duyệt dự án nhưng chưa khởi công, tuyến IC18 còn thiếu khoảng 50 tỷ đồng; đường vào và khu tái định cư Mông Sơn chưa có chủ trương đầu tư; khu vực Cam Đường - Gia Phú chưa có dự án cấp nước; Trạm biến áp 110 kV Thống Nhất 1 chưa có trong kế hoạch đầu tư.</w:t>
       </w:r>
     </w:p>
     <w:p>
@@ -927,7 +942,7 @@
           <w:i w:val="0"/>
           <w:sz w:val="30"/>
         </w:rPr>
-        <w:t xml:space="preserve"> lập đường găng cho từng khu, cụm theo các mốc tại Thông báo số 181/TB-VPUBND ngày 08/10/2026; bám sát mốc khởi công Khu công nghiệp Võ Lao, Khu công nghiệp Cam Đường trong tháng 11/2026 và Cụm công nghiệp Mông Sơn trước ngày 31/12/2026; mời gọi nhà đầu tư thứ cấp ngay khi đang làm hạ tầng; chịu trách nhiệm về số liệu và nội dung kiến nghị.</w:t>
+        <w:t xml:space="preserve"> lập đường găng cho từng khu, cụm theo các mốc tại Thông báo số 181/TB-VPUBND ngày 08/10/2026; bám sát mốc khởi công Khu công nghiệp Võ Lao, Khu công nghiệp Cam Đường trong tháng 11/2026 và Cụm công nghiệp Mông Sơn trước ngày 31/12/2026; mời gọi nhà đầu tư thứ cấp ngay khi đang làm hạ tầng; chịu trách nhiệm về số liệu, tiến độ đã cam kết và nội dung kiến nghị.</w:t>
       </w:r>
     </w:p>
     <w:p>
@@ -966,7 +981,7 @@
           <w:i w:val="0"/>
           <w:sz w:val="30"/>
         </w:rPr>
-        <w:t>Sở Công Thương rất mong tiếp tục nhận được sự lãnh đạo, chỉ đạo của Thường trực Tỉnh ủy và sự phối hợp của các sở, ngành, địa phương. Xin trân trọng cảm ơn!</w:t>
+        <w:t>Mặt bằng sạch đến đâu, nhà máy mọc lên đến đó; làm tốt hai tháng cuối năm nay là tạo đà cho tăng trưởng công nghiệp của cả năm 2027. Sở Công Thương rất mong tiếp tục nhận được sự lãnh đạo, chỉ đạo của Thường trực Tỉnh ủy và sự phối hợp của các sở, ngành, địa phương. Xin trân trọng cảm ơn!</w:t>
       </w:r>
     </w:p>
     <w:sectPr>

</xml_diff>

<commit_message>
bpb-sct-vn: bản in cuối bài phát biểu BCH 28/10 (soát lỗi bản Giám đốc, một câu chốt) thay file gd-duyet; reference ghi lỗi soát được và chỗ chỉnh (#159)
Claude-Session: https://claude.ai/code/session_01H7QU2F3W63CLMpeCgUioam

Co-authored-by: Claude <noreply@anthropic.com>
</commit_message>
<xml_diff>
--- a/bpb-sct-vn/skills/bpb-sct-vn/kho-bai-mau/bpb-bch-dang-bo-tinh-2026-10-28-khu-cum-cong-nghiep-gd-duyet.docx
+++ b/bpb-sct-vn/skills/bpb-sct-vn/kho-bai-mau/bpb-bch-dang-bo-tinh-2026-10-28-khu-cum-cong-nghiep-gd-duyet.docx
@@ -147,7 +147,7 @@
           <w:i w:val="0"/>
           <w:sz w:val="30"/>
         </w:rPr>
-        <w:t>Chủ tịch Ủy ban nhân dân tỉnh đã thành lập 02 Ban Chỉ đạo phát triển khu công nghiệp tại các Quyết định số 2029/QĐ-UBND và số 2030/QĐ-UBND ngày 10/6/2026, do hai đồng chí Phó Chủ tịch Ủy ban nhân dân tỉnh (Nguyễn Thành Sinh, Phan Trung Bá) làm Trưởng ban, Ban Quản lý Khu kinh tế tỉnh là cơ quan thường trực.</w:t>
+        <w:t>Chủ tịch Ủy ban nhân dân tỉnh đã thành lập 02 Ban Chỉ đạo phát triển khu công nghiệp tại các Quyết định số 2029/QĐ-UBND và số 2030/QĐ-UBND ngày 10/6/2026, do hai đồng chí Phó Chủ tịch Ủy ban nhân dân tỉnh Nguyễn Thành Sinh và Phan Trung Bá làm Trưởng ban, Ban Quản lý Khu kinh tế tỉnh là cơ quan thường trực.</w:t>
       </w:r>
     </w:p>
     <w:p>
@@ -224,7 +224,7 @@
           <w:i w:val="0"/>
           <w:sz w:val="30"/>
         </w:rPr>
-        <w:t>Nhóm này đang tạo ra phần lớn giá trị sản xuất công nghiệp của tỉnh và quyết định sản lượng hai tháng cuối năm: tại Tằng Loỏng, axit photphoric mới đạt 39%, phân DAP mới đạt 62,9% kế hoạch năm. Vướng mắc của nhóm này là hạ tầng chưa đồng bộ, môi trường và các tồn tại kéo dài:</w:t>
+        <w:t>Nhóm này đang tạo ra phần lớn giá trị sản xuất công nghiệp của tỉnh và quyết định sản lượng hai tháng cuối năm: tại Tằng Loỏng, axit photphoric mới đạt 39%, phân DAP mới đạt 62,9% kế hoạch năm. Vướng mắc của nhóm này là hạ tầng chưa đồng bộ, áp lực về môi trường và các tồn tại kéo dài:</w:t>
       </w:r>
     </w:p>
     <w:p>
@@ -254,7 +254,22 @@
           <w:i w:val="0"/>
           <w:sz w:val="30"/>
         </w:rPr>
-        <w:t>- Đề án chuyển đổi Khu công nghiệp Tằng Loỏng sang khu công nghiệp sinh thái, xây dựng đã hơn 01 năm, qua 03 lần trình; Phó Chủ tịch Thường trực Ủy ban nhân dân tỉnh đã kết luận tại Thông báo số 192/TB-VPUBND ngày 28/10/2026: chuyển đổi là yêu cầu bắt buộc, Đề án phải có nhiệm vụ cụ thể, có địa chỉ, có thời hạn, hoàn thiện trong tháng 12/2026; dự án di chuyển dân cư ra khỏi ranh giới khu công nghiệp chưa được quyết định. Khu công nghiệp Đông Phố Mới phải có hạ tầng Cụm công nghiệp Bát Xát tại khu vực Bản Qua thì mới di dời được các cơ sở sản xuất theo lộ trình.</w:t>
+        <w:t>- Đề án chuyển đổi Khu công nghiệp Tằng Loỏng sang khu công nghiệp sinh thái, xây dựng đã hơn 01 năm, qua 03 lần trình; Phó Chủ tịch Thường trực Ủy ban nhân dân tỉnh đã kết luận tại Thông báo số 192/TB-VPUBND ngày 28/10/2026: chuyển đổi là yêu cầu bắt buộc, Đề án phải có nhiệm vụ cụ thể, có địa chỉ, có thời hạn, hoàn thiện trong tháng 12/2026; dự án di chuyển dân cư ra khỏi ranh giới khu công nghiệp chưa được quyết định.</w:t>
+      </w:r>
+    </w:p>
+    <w:p>
+      <w:pPr>
+        <w:ind w:firstLine="720"/>
+        <w:jc w:val="both"/>
+      </w:pPr>
+      <w:r>
+        <w:rPr>
+          <w:rFonts w:ascii="Times New Roman" w:hAnsi="Times New Roman" w:eastAsia="Times New Roman"/>
+          <w:b w:val="0"/>
+          <w:i w:val="0"/>
+          <w:sz w:val="30"/>
+        </w:rPr>
+        <w:t>- Khu công nghiệp Đông Phố Mới chỉ di dời được các cơ sở sản xuất theo lộ trình khi có hạ tầng Cụm công nghiệp Bát Xát tại khu vực Bản Qua.</w:t>
       </w:r>
     </w:p>
     <w:p>
@@ -384,7 +399,7 @@
           <w:i w:val="0"/>
           <w:sz w:val="30"/>
         </w:rPr>
-        <w:t xml:space="preserve"> Khu tái định cư Phú Xuân (Quyết định số 3105/QĐ-UBND ngày 27/8/2026) chưa xây dựng xong; khu tái định cư Khu công nghiệp Võ Lao chưa có chủ trương đầu tư; Khu công nghiệp Bản Qua chưa có khu tái định cư; Khu công nghiệp Cam Đường cần 212 lô. Chưa có đất tái định cư thì dân chưa thể bàn giao mặt bằng.</w:t>
+        <w:t xml:space="preserve"> Khu tái định cư Phú Xuân (Quyết định số 3105/QĐ-UBND ngày 27/8/2026) chưa xây dựng xong; khu tái định cư Khu công nghiệp Võ Lao chưa có chủ trương đầu tư; Khu công nghiệp Bản Qua chưa có khu tái định cư; Khu công nghiệp Cam Đường cần 212 lô. Chưa có đất tái định cư thì người dân chưa thể bàn giao mặt bằng.</w:t>
       </w:r>
     </w:p>
     <w:p>
@@ -503,7 +518,7 @@
           <w:i w:val="0"/>
           <w:sz w:val="30"/>
         </w:rPr>
-        <w:t>Cụm công nghiệp Thống Nhất 1 (74,95 ha) khởi công ngày 07/5/2026, đã chi trả 142/144 hộ, đang thi công hạ tầng. Các Cụm công nghiệp Phú Thịnh 1, Phú Thịnh 2, Phú Thịnh 3 có một vướng mắc chung là 72,23 ha đất Chè Văn Hưng tồn tại từ năm 2016; Phú Thịnh 3 đã khởi công ngày 16/7/2026. Cụm công nghiệp Mông Sơn (50 ha) thành lập tại Quyết định số 3426/QĐ-UBND ngày 23/9/2026. Tại xã Xuân Ái còn có các Cụm công nghiệp Yên Hợp 2 (75 ha, Quyết định số 3427/QĐ-UBND ngày 23/9/2026) và Xuân Ái (75 ha, Quyết định số 3865/QĐ-UBND ngày 17/10/2026) mới thành lập, cần chuẩn bị sớm mặt bằng.</w:t>
+        <w:t>Cụm công nghiệp Thống Nhất 1 (74,95 ha) khởi công ngày 07/5/2026, đã chi trả 142/144 hộ, đang thi công hạ tầng. Các Cụm công nghiệp Phú Thịnh 1, Phú Thịnh 2, Phú Thịnh 3 có một vướng mắc chung là 72,23 ha đất Chè Văn Hưng tồn tại từ năm 2016; Phú Thịnh 3 đã khởi công ngày 16/7/2026. Cụm công nghiệp Mông Sơn (50 ha) thành lập tại Quyết định số 3426/QĐ-UBND ngày 23/9/2026. Tại xã Xuân Ái còn có các Cụm công nghiệp Yên Hợp 2 (75 ha, Quyết định số 3427/QĐ-UBND ngày 23/9/2026) và Xuân Ái (75 ha, Quyết định số 3865/QĐ-UBND ngày 17/10/2026) mới thành lập, cần chuẩn bị mặt bằng ngay từ bây giờ.</w:t>
       </w:r>
     </w:p>
     <w:p>
@@ -518,7 +533,7 @@
           <w:i w:val="0"/>
           <w:sz w:val="30"/>
         </w:rPr>
-        <w:t>Vướng mắc lớn nhất ở các cụm là xác định nguồn gốc đất, đối tượng được bồi thường; riêng đất Chè Văn Hưng chưa xong thì cả ba Cụm công nghiệp Phú Thịnh 1, Phú Thịnh 2, Phú Thịnh 3 đều không triển khai được. Về hạ tầng: hai tuyến đường IC18 và Quốc lộ 4E vào Thống Nhất 1 đã phê duyệt dự án nhưng chưa khởi công, tuyến IC18 còn thiếu khoảng 50 tỷ đồng; đường vào và khu tái định cư Mông Sơn chưa có chủ trương đầu tư; khu vực Cam Đường - Gia Phú chưa có dự án cấp nước; Trạm biến áp 110 kV Thống Nhất 1 chưa có trong kế hoạch đầu tư.</w:t>
+        <w:t>Vướng mắc lớn nhất ở các cụm là xác định nguồn gốc đất, đối tượng được bồi thường; riêng 72,23 ha đất Chè Văn Hưng chưa xử lý xong thì cả ba Cụm công nghiệp Phú Thịnh 1, Phú Thịnh 2, Phú Thịnh 3 đều không thể triển khai. Về hạ tầng: hai tuyến đường IC18 và Quốc lộ 4E vào Thống Nhất 1 đã phê duyệt dự án nhưng chưa khởi công, tuyến IC18 còn thiếu khoảng 50 tỷ đồng; đường vào và khu tái định cư Mông Sơn chưa có chủ trương đầu tư; khu vực Cam Đường - Gia Phú chưa có dự án cấp nước; Trạm biến áp 110 kV Thống Nhất 1 chưa có trong kế hoạch đầu tư.</w:t>
       </w:r>
     </w:p>
     <w:p>
@@ -927,7 +942,7 @@
           <w:i w:val="0"/>
           <w:sz w:val="30"/>
         </w:rPr>
-        <w:t xml:space="preserve"> lập đường găng cho từng khu, cụm theo các mốc tại Thông báo số 181/TB-VPUBND ngày 08/10/2026; bám sát mốc khởi công Khu công nghiệp Võ Lao, Khu công nghiệp Cam Đường trong tháng 11/2026 và Cụm công nghiệp Mông Sơn trước ngày 31/12/2026; mời gọi nhà đầu tư thứ cấp ngay khi đang làm hạ tầng; chịu trách nhiệm về số liệu và nội dung kiến nghị.</w:t>
+        <w:t xml:space="preserve"> lập đường găng cho từng khu, cụm theo các mốc tại Thông báo số 181/TB-VPUBND ngày 08/10/2026; bám sát mốc khởi công Khu công nghiệp Võ Lao, Khu công nghiệp Cam Đường trong tháng 11/2026 và Cụm công nghiệp Mông Sơn trước ngày 31/12/2026; mời gọi nhà đầu tư thứ cấp ngay khi đang làm hạ tầng; chịu trách nhiệm về số liệu, tiến độ đã cam kết và nội dung kiến nghị.</w:t>
       </w:r>
     </w:p>
     <w:p>
@@ -966,7 +981,7 @@
           <w:i w:val="0"/>
           <w:sz w:val="30"/>
         </w:rPr>
-        <w:t>Sở Công Thương rất mong tiếp tục nhận được sự lãnh đạo, chỉ đạo của Thường trực Tỉnh ủy và sự phối hợp của các sở, ngành, địa phương. Xin trân trọng cảm ơn!</w:t>
+        <w:t>Mặt bằng sạch đến đâu, nhà máy mọc lên đến đó; làm tốt hai tháng cuối năm nay là tạo đà cho tăng trưởng công nghiệp của cả năm 2027. Sở Công Thương rất mong tiếp tục nhận được sự lãnh đạo, chỉ đạo của Thường trực Tỉnh ủy và sự phối hợp của các sở, ngành, địa phương. Xin trân trọng cảm ơn!</w:t>
       </w:r>
     </w:p>
     <w:sectPr>

</xml_diff>

<commit_message>
kccn-sct-vn 1.61.1, bpb-sct-vn 1.8.1: sổ lỗi kccn L001 (06 KCN đang hoạt động), L002 (Đông Phố Mới di dời về Khu Bản Qua); 2 rule check_facts; R21; bản in cuối bài phát biểu BCH
Co-Authored-By: Claude Fable 5.1 <noreply@anthropic.com>
Claude-Session: https://claude.ai/code/session_01H7QU2F3W63CLMpeCgUioam
</commit_message>
<xml_diff>
--- a/bpb-sct-vn/skills/bpb-sct-vn/kho-bai-mau/bpb-bch-dang-bo-tinh-2026-10-28-khu-cum-cong-nghiep-gd-duyet.docx
+++ b/bpb-sct-vn/skills/bpb-sct-vn/kho-bai-mau/bpb-bch-dang-bo-tinh-2026-10-28-khu-cum-cong-nghiep-gd-duyet.docx
@@ -209,7 +209,7 @@
           <w:i w:val="0"/>
           <w:sz w:val="30"/>
         </w:rPr>
-        <w:t>1. Các khu công nghiệp đang hoạt động: Tằng Loỏng, Đông Phố Mới, Minh Quân, Phía Nam</w:t>
+        <w:t>1. Các khu công nghiệp đang hoạt động: Tằng Loỏng, Đông Phố Mới, Bắc Duyên Hải, Phía Nam, Âu Lâu, Minh Quân</w:t>
       </w:r>
     </w:p>
     <w:p>
@@ -224,7 +224,7 @@
           <w:i w:val="0"/>
           <w:sz w:val="30"/>
         </w:rPr>
-        <w:t>Nhóm này đang tạo ra phần lớn giá trị sản xuất công nghiệp của tỉnh và quyết định sản lượng hai tháng cuối năm: tại Tằng Loỏng, axit photphoric mới đạt 39%, phân DAP mới đạt 62,9% kế hoạch năm. Vướng mắc của nhóm này là hạ tầng chưa đồng bộ, áp lực về môi trường và các tồn tại kéo dài:</w:t>
+        <w:t>Nhóm này đang tạo ra phần lớn giá trị sản xuất công nghiệp của tỉnh và quyết định sản lượng hai tháng cuối năm: tại Tằng Loỏng, axit photphoric mới đạt 39%, phân DAP mới đạt 62,9% kế hoạch năm. Vướng mắc của nhóm này là hạ tầng chưa đồng bộ, áp lực môi trường và các tồn tại kéo dài:</w:t>
       </w:r>
     </w:p>
     <w:p>
@@ -254,22 +254,7 @@
           <w:i w:val="0"/>
           <w:sz w:val="30"/>
         </w:rPr>
-        <w:t>- Đề án chuyển đổi Khu công nghiệp Tằng Loỏng sang khu công nghiệp sinh thái, xây dựng đã hơn 01 năm, qua 03 lần trình; Phó Chủ tịch Thường trực Ủy ban nhân dân tỉnh đã kết luận tại Thông báo số 192/TB-VPUBND ngày 28/10/2026: chuyển đổi là yêu cầu bắt buộc, Đề án phải có nhiệm vụ cụ thể, có địa chỉ, có thời hạn, hoàn thiện trong tháng 12/2026; dự án di chuyển dân cư ra khỏi ranh giới khu công nghiệp chưa được quyết định.</w:t>
-      </w:r>
-    </w:p>
-    <w:p>
-      <w:pPr>
-        <w:ind w:firstLine="720"/>
-        <w:jc w:val="both"/>
-      </w:pPr>
-      <w:r>
-        <w:rPr>
-          <w:rFonts w:ascii="Times New Roman" w:hAnsi="Times New Roman" w:eastAsia="Times New Roman"/>
-          <w:b w:val="0"/>
-          <w:i w:val="0"/>
-          <w:sz w:val="30"/>
-        </w:rPr>
-        <w:t>- Khu công nghiệp Đông Phố Mới chỉ di dời được các cơ sở sản xuất theo lộ trình khi có hạ tầng Cụm công nghiệp Bát Xát tại khu vực Bản Qua.</w:t>
+        <w:t>- Đề án chuyển đổi Khu công nghiệp Tằng Loỏng sang khu công nghiệp sinh thái, xây dựng đã hơn 01 năm, qua 03 lần trình; Phó Chủ tịch Thường trực Ủy ban nhân dân tỉnh đã kết luận tại Thông báo số 192/TB-VPUBND ngày 28/10/2026: chuyển đổi là yêu cầu bắt buộc, Đề án phải có nhiệm vụ cụ thể, có địa chỉ, có thời hạn, hoàn thiện trong tháng 12/2026; dự án di chuyển dân cư ra khỏi ranh giới khu công nghiệp chưa được quyết định. Khu công nghiệp Đông Phố Mới chỉ di dời được các cơ sở sản xuất theo lộ trình khi hoàn thành hạ tầng tái định cư cho doanh nghiệp tại Khu Bản Qua, xã Bát Xát (95 ha, bố trí 34 doanh nghiệp).</w:t>
       </w:r>
     </w:p>
     <w:p>
@@ -518,7 +503,7 @@
           <w:i w:val="0"/>
           <w:sz w:val="30"/>
         </w:rPr>
-        <w:t>Cụm công nghiệp Thống Nhất 1 (74,95 ha) khởi công ngày 07/5/2026, đã chi trả 142/144 hộ, đang thi công hạ tầng. Các Cụm công nghiệp Phú Thịnh 1, Phú Thịnh 2, Phú Thịnh 3 có một vướng mắc chung là 72,23 ha đất Chè Văn Hưng tồn tại từ năm 2016; Phú Thịnh 3 đã khởi công ngày 16/7/2026. Cụm công nghiệp Mông Sơn (50 ha) thành lập tại Quyết định số 3426/QĐ-UBND ngày 23/9/2026. Tại xã Xuân Ái còn có các Cụm công nghiệp Yên Hợp 2 (75 ha, Quyết định số 3427/QĐ-UBND ngày 23/9/2026) và Xuân Ái (75 ha, Quyết định số 3865/QĐ-UBND ngày 17/10/2026) mới thành lập, cần chuẩn bị mặt bằng ngay từ bây giờ.</w:t>
+        <w:t>Cụm công nghiệp Thống Nhất 1 (74,95 ha) khởi công ngày 07/5/2026, đã chi trả 142/144 hộ, đang thi công hạ tầng. Các Cụm công nghiệp Phú Thịnh 1, Phú Thịnh 2, Phú Thịnh 3 có một vướng mắc chung là 72,23 ha đất Chè Văn Hưng tồn tại từ năm 2016; Phú Thịnh 3 đã khởi công ngày 16/7/2026. Cụm công nghiệp Mông Sơn (50 ha) thành lập tại Quyết định số 3426/QĐ-UBND ngày 23/9/2026. Tại xã Xuân Ái còn có các Cụm công nghiệp Yên Hợp 2 (75 ha, Quyết định số 3427/QĐ-UBND ngày 23/9/2026) và Xuân Ái (75 ha, Quyết định số 3865/QĐ-UBND ngày 17/10/2026) mới thành lập, cần chuẩn bị sớm mặt bằng.</w:t>
       </w:r>
     </w:p>
     <w:p>
@@ -857,7 +842,7 @@
           <w:i w:val="0"/>
           <w:sz w:val="30"/>
         </w:rPr>
-        <w:t>- Ban Quản lý dự án đầu tư xây dựng tỉnh đầu tư dứt điểm hạ tầng Cụm công nghiệp Bát Xát để di dời các cơ sở trong Khu công nghiệp Đông Phố Mới.</w:t>
+        <w:t>- Đề nghị Ban Quản lý Khu kinh tế tỉnh và chủ đầu tư hoàn thành dứt điểm hạ tầng Khu Bản Qua trước ngày 31/12/2026 để di dời các cơ sở trong Khu công nghiệp Đông Phố Mới.</w:t>
       </w:r>
     </w:p>
     <w:p>
@@ -942,7 +927,7 @@
           <w:i w:val="0"/>
           <w:sz w:val="30"/>
         </w:rPr>
-        <w:t xml:space="preserve"> lập đường găng cho từng khu, cụm theo các mốc tại Thông báo số 181/TB-VPUBND ngày 08/10/2026; bám sát mốc khởi công Khu công nghiệp Võ Lao, Khu công nghiệp Cam Đường trong tháng 11/2026 và Cụm công nghiệp Mông Sơn trước ngày 31/12/2026; mời gọi nhà đầu tư thứ cấp ngay khi đang làm hạ tầng; chịu trách nhiệm về số liệu, tiến độ đã cam kết và nội dung kiến nghị.</w:t>
+        <w:t xml:space="preserve"> lập đường găng cho từng khu, cụm theo các mốc tại Thông báo số 181/TB-VPUBND ngày 08/10/2026; bám sát mốc khởi công Khu công nghiệp Võ Lao, Khu công nghiệp Cam Đường trong tháng 11/2026 và Cụm công nghiệp Mông Sơn trước ngày 31/12/2026; mời gọi nhà đầu tư thứ cấp ngay khi đang làm hạ tầng; chịu trách nhiệm về số liệu và nội dung kiến nghị.</w:t>
       </w:r>
     </w:p>
     <w:p>
@@ -981,7 +966,7 @@
           <w:i w:val="0"/>
           <w:sz w:val="30"/>
         </w:rPr>
-        <w:t>Mặt bằng sạch đến đâu, nhà máy mọc lên đến đó; làm tốt hai tháng cuối năm nay là tạo đà cho tăng trưởng công nghiệp của cả năm 2027. Sở Công Thương rất mong tiếp tục nhận được sự lãnh đạo, chỉ đạo của Thường trực Tỉnh ủy và sự phối hợp của các sở, ngành, địa phương. Xin trân trọng cảm ơn!</w:t>
+        <w:t>Mặt bằng sạch đến đâu, nhà máy mọc lên đến đó. Sở Công Thương rất mong tiếp tục nhận được sự lãnh đạo, chỉ đạo của Thường trực Tỉnh ủy và sự phối hợp của các sở, ngành, địa phương. Xin trân trọng cảm ơn!</w:t>
       </w:r>
     </w:p>
     <w:sectPr>

</xml_diff>

<commit_message>
kccn-sct-vn 1.61.1, bpb-sct-vn 1.8.1: sổ lỗi kccn L001 (06 KCN đang hoạt động), L002 (Đông Phố Mới di dời về Khu Bản Qua); 2 rule check_facts; R21; bản in cuối bài phát biểu BCH (#160)
Claude-Session: https://claude.ai/code/session_01H7QU2F3W63CLMpeCgUioam

Co-authored-by: Claude <noreply@anthropic.com>
</commit_message>
<xml_diff>
--- a/bpb-sct-vn/skills/bpb-sct-vn/kho-bai-mau/bpb-bch-dang-bo-tinh-2026-10-28-khu-cum-cong-nghiep-gd-duyet.docx
+++ b/bpb-sct-vn/skills/bpb-sct-vn/kho-bai-mau/bpb-bch-dang-bo-tinh-2026-10-28-khu-cum-cong-nghiep-gd-duyet.docx
@@ -209,7 +209,7 @@
           <w:i w:val="0"/>
           <w:sz w:val="30"/>
         </w:rPr>
-        <w:t>1. Các khu công nghiệp đang hoạt động: Tằng Loỏng, Đông Phố Mới, Minh Quân, Phía Nam</w:t>
+        <w:t>1. Các khu công nghiệp đang hoạt động: Tằng Loỏng, Đông Phố Mới, Bắc Duyên Hải, Phía Nam, Âu Lâu, Minh Quân</w:t>
       </w:r>
     </w:p>
     <w:p>
@@ -224,7 +224,7 @@
           <w:i w:val="0"/>
           <w:sz w:val="30"/>
         </w:rPr>
-        <w:t>Nhóm này đang tạo ra phần lớn giá trị sản xuất công nghiệp của tỉnh và quyết định sản lượng hai tháng cuối năm: tại Tằng Loỏng, axit photphoric mới đạt 39%, phân DAP mới đạt 62,9% kế hoạch năm. Vướng mắc của nhóm này là hạ tầng chưa đồng bộ, áp lực về môi trường và các tồn tại kéo dài:</w:t>
+        <w:t>Nhóm này đang tạo ra phần lớn giá trị sản xuất công nghiệp của tỉnh và quyết định sản lượng hai tháng cuối năm: tại Tằng Loỏng, axit photphoric mới đạt 39%, phân DAP mới đạt 62,9% kế hoạch năm. Vướng mắc của nhóm này là hạ tầng chưa đồng bộ, áp lực môi trường và các tồn tại kéo dài:</w:t>
       </w:r>
     </w:p>
     <w:p>
@@ -254,22 +254,7 @@
           <w:i w:val="0"/>
           <w:sz w:val="30"/>
         </w:rPr>
-        <w:t>- Đề án chuyển đổi Khu công nghiệp Tằng Loỏng sang khu công nghiệp sinh thái, xây dựng đã hơn 01 năm, qua 03 lần trình; Phó Chủ tịch Thường trực Ủy ban nhân dân tỉnh đã kết luận tại Thông báo số 192/TB-VPUBND ngày 28/10/2026: chuyển đổi là yêu cầu bắt buộc, Đề án phải có nhiệm vụ cụ thể, có địa chỉ, có thời hạn, hoàn thiện trong tháng 12/2026; dự án di chuyển dân cư ra khỏi ranh giới khu công nghiệp chưa được quyết định.</w:t>
-      </w:r>
-    </w:p>
-    <w:p>
-      <w:pPr>
-        <w:ind w:firstLine="720"/>
-        <w:jc w:val="both"/>
-      </w:pPr>
-      <w:r>
-        <w:rPr>
-          <w:rFonts w:ascii="Times New Roman" w:hAnsi="Times New Roman" w:eastAsia="Times New Roman"/>
-          <w:b w:val="0"/>
-          <w:i w:val="0"/>
-          <w:sz w:val="30"/>
-        </w:rPr>
-        <w:t>- Khu công nghiệp Đông Phố Mới chỉ di dời được các cơ sở sản xuất theo lộ trình khi có hạ tầng Cụm công nghiệp Bát Xát tại khu vực Bản Qua.</w:t>
+        <w:t>- Đề án chuyển đổi Khu công nghiệp Tằng Loỏng sang khu công nghiệp sinh thái, xây dựng đã hơn 01 năm, qua 03 lần trình; Phó Chủ tịch Thường trực Ủy ban nhân dân tỉnh đã kết luận tại Thông báo số 192/TB-VPUBND ngày 28/10/2026: chuyển đổi là yêu cầu bắt buộc, Đề án phải có nhiệm vụ cụ thể, có địa chỉ, có thời hạn, hoàn thiện trong tháng 12/2026; dự án di chuyển dân cư ra khỏi ranh giới khu công nghiệp chưa được quyết định. Khu công nghiệp Đông Phố Mới chỉ di dời được các cơ sở sản xuất theo lộ trình khi hoàn thành hạ tầng tái định cư cho doanh nghiệp tại Khu Bản Qua, xã Bát Xát (95 ha, bố trí 34 doanh nghiệp).</w:t>
       </w:r>
     </w:p>
     <w:p>
@@ -518,7 +503,7 @@
           <w:i w:val="0"/>
           <w:sz w:val="30"/>
         </w:rPr>
-        <w:t>Cụm công nghiệp Thống Nhất 1 (74,95 ha) khởi công ngày 07/5/2026, đã chi trả 142/144 hộ, đang thi công hạ tầng. Các Cụm công nghiệp Phú Thịnh 1, Phú Thịnh 2, Phú Thịnh 3 có một vướng mắc chung là 72,23 ha đất Chè Văn Hưng tồn tại từ năm 2016; Phú Thịnh 3 đã khởi công ngày 16/7/2026. Cụm công nghiệp Mông Sơn (50 ha) thành lập tại Quyết định số 3426/QĐ-UBND ngày 23/9/2026. Tại xã Xuân Ái còn có các Cụm công nghiệp Yên Hợp 2 (75 ha, Quyết định số 3427/QĐ-UBND ngày 23/9/2026) và Xuân Ái (75 ha, Quyết định số 3865/QĐ-UBND ngày 17/10/2026) mới thành lập, cần chuẩn bị mặt bằng ngay từ bây giờ.</w:t>
+        <w:t>Cụm công nghiệp Thống Nhất 1 (74,95 ha) khởi công ngày 07/5/2026, đã chi trả 142/144 hộ, đang thi công hạ tầng. Các Cụm công nghiệp Phú Thịnh 1, Phú Thịnh 2, Phú Thịnh 3 có một vướng mắc chung là 72,23 ha đất Chè Văn Hưng tồn tại từ năm 2016; Phú Thịnh 3 đã khởi công ngày 16/7/2026. Cụm công nghiệp Mông Sơn (50 ha) thành lập tại Quyết định số 3426/QĐ-UBND ngày 23/9/2026. Tại xã Xuân Ái còn có các Cụm công nghiệp Yên Hợp 2 (75 ha, Quyết định số 3427/QĐ-UBND ngày 23/9/2026) và Xuân Ái (75 ha, Quyết định số 3865/QĐ-UBND ngày 17/10/2026) mới thành lập, cần chuẩn bị sớm mặt bằng.</w:t>
       </w:r>
     </w:p>
     <w:p>
@@ -857,7 +842,7 @@
           <w:i w:val="0"/>
           <w:sz w:val="30"/>
         </w:rPr>
-        <w:t>- Ban Quản lý dự án đầu tư xây dựng tỉnh đầu tư dứt điểm hạ tầng Cụm công nghiệp Bát Xát để di dời các cơ sở trong Khu công nghiệp Đông Phố Mới.</w:t>
+        <w:t>- Đề nghị Ban Quản lý Khu kinh tế tỉnh và chủ đầu tư hoàn thành dứt điểm hạ tầng Khu Bản Qua trước ngày 31/12/2026 để di dời các cơ sở trong Khu công nghiệp Đông Phố Mới.</w:t>
       </w:r>
     </w:p>
     <w:p>
@@ -942,7 +927,7 @@
           <w:i w:val="0"/>
           <w:sz w:val="30"/>
         </w:rPr>
-        <w:t xml:space="preserve"> lập đường găng cho từng khu, cụm theo các mốc tại Thông báo số 181/TB-VPUBND ngày 08/10/2026; bám sát mốc khởi công Khu công nghiệp Võ Lao, Khu công nghiệp Cam Đường trong tháng 11/2026 và Cụm công nghiệp Mông Sơn trước ngày 31/12/2026; mời gọi nhà đầu tư thứ cấp ngay khi đang làm hạ tầng; chịu trách nhiệm về số liệu, tiến độ đã cam kết và nội dung kiến nghị.</w:t>
+        <w:t xml:space="preserve"> lập đường găng cho từng khu, cụm theo các mốc tại Thông báo số 181/TB-VPUBND ngày 08/10/2026; bám sát mốc khởi công Khu công nghiệp Võ Lao, Khu công nghiệp Cam Đường trong tháng 11/2026 và Cụm công nghiệp Mông Sơn trước ngày 31/12/2026; mời gọi nhà đầu tư thứ cấp ngay khi đang làm hạ tầng; chịu trách nhiệm về số liệu và nội dung kiến nghị.</w:t>
       </w:r>
     </w:p>
     <w:p>
@@ -981,7 +966,7 @@
           <w:i w:val="0"/>
           <w:sz w:val="30"/>
         </w:rPr>
-        <w:t>Mặt bằng sạch đến đâu, nhà máy mọc lên đến đó; làm tốt hai tháng cuối năm nay là tạo đà cho tăng trưởng công nghiệp của cả năm 2027. Sở Công Thương rất mong tiếp tục nhận được sự lãnh đạo, chỉ đạo của Thường trực Tỉnh ủy và sự phối hợp của các sở, ngành, địa phương. Xin trân trọng cảm ơn!</w:t>
+        <w:t>Mặt bằng sạch đến đâu, nhà máy mọc lên đến đó. Sở Công Thương rất mong tiếp tục nhận được sự lãnh đạo, chỉ đạo của Thường trực Tỉnh ủy và sự phối hợp của các sở, ngành, địa phương. Xin trân trọng cảm ơn!</w:t>
       </w:r>
     </w:p>
     <w:sectPr>

</xml_diff>

<commit_message>
bpb-sct-vn 1.8.2: khẩu hiệu hành động kết bài phát biểu BCH (R22), bản in cuối 29/10; nhật ký ctr-130
Co-Authored-By: Claude Fable 5.1 <noreply@anthropic.com>
Claude-Session: https://claude.ai/code/session_01H7QU2F3W63CLMpeCgUioam
</commit_message>
<xml_diff>
--- a/bpb-sct-vn/skills/bpb-sct-vn/kho-bai-mau/bpb-bch-dang-bo-tinh-2026-10-28-khu-cum-cong-nghiep-gd-duyet.docx
+++ b/bpb-sct-vn/skills/bpb-sct-vn/kho-bai-mau/bpb-bch-dang-bo-tinh-2026-10-28-khu-cum-cong-nghiep-gd-duyet.docx
@@ -956,6 +956,31 @@
     </w:p>
     <w:p>
       <w:pPr>
+        <w:keepNext/>
+        <w:jc w:val="center"/>
+      </w:pPr>
+      <w:r>
+        <w:rPr>
+          <w:rFonts w:ascii="Times New Roman" w:hAnsi="Times New Roman" w:eastAsia="Times New Roman"/>
+          <w:b/>
+          <w:i/>
+          <w:sz w:val="30"/>
+        </w:rPr>
+        <w:t>“Mặt bằng sạch đến đâu, dự án về đến đó;</w:t>
+        <w:br/>
+      </w:r>
+      <w:r>
+        <w:rPr>
+          <w:rFonts w:ascii="Times New Roman" w:hAnsi="Times New Roman" w:eastAsia="Times New Roman"/>
+          <w:b/>
+          <w:i/>
+          <w:sz w:val="30"/>
+        </w:rPr>
+        <w:t>công nghiệp vươn xa, Lào Cai bứt phá!”</w:t>
+      </w:r>
+    </w:p>
+    <w:p>
+      <w:pPr>
         <w:ind w:firstLine="720"/>
         <w:jc w:val="both"/>
       </w:pPr>
@@ -966,7 +991,7 @@
           <w:i w:val="0"/>
           <w:sz w:val="30"/>
         </w:rPr>
-        <w:t>Mặt bằng sạch đến đâu, nhà máy mọc lên đến đó. Sở Công Thương rất mong tiếp tục nhận được sự lãnh đạo, chỉ đạo của Thường trực Tỉnh ủy và sự phối hợp của các sở, ngành, địa phương. Xin trân trọng cảm ơn!</w:t>
+        <w:t>Với khẩu hiệu hành động đó, Sở Công Thương rất mong tiếp tục nhận được sự lãnh đạo, chỉ đạo của Thường trực Tỉnh ủy và sự phối hợp của các sở, ngành, địa phương. Xin trân trọng cảm ơn!</w:t>
       </w:r>
     </w:p>
     <w:sectPr>

</xml_diff>

<commit_message>
bpb-sct-vn 1.8.2: khẩu hiệu hành động kết bài phát biểu BCH (R22), bản in cuối 29/10; nhật ký ctr-130 (#163)
Claude-Session: https://claude.ai/code/session_01H7QU2F3W63CLMpeCgUioam

Co-authored-by: Claude <noreply@anthropic.com>
</commit_message>
<xml_diff>
--- a/bpb-sct-vn/skills/bpb-sct-vn/kho-bai-mau/bpb-bch-dang-bo-tinh-2026-10-28-khu-cum-cong-nghiep-gd-duyet.docx
+++ b/bpb-sct-vn/skills/bpb-sct-vn/kho-bai-mau/bpb-bch-dang-bo-tinh-2026-10-28-khu-cum-cong-nghiep-gd-duyet.docx
@@ -956,6 +956,31 @@
     </w:p>
     <w:p>
       <w:pPr>
+        <w:keepNext/>
+        <w:jc w:val="center"/>
+      </w:pPr>
+      <w:r>
+        <w:rPr>
+          <w:rFonts w:ascii="Times New Roman" w:hAnsi="Times New Roman" w:eastAsia="Times New Roman"/>
+          <w:b/>
+          <w:i/>
+          <w:sz w:val="30"/>
+        </w:rPr>
+        <w:t>“Mặt bằng sạch đến đâu, dự án về đến đó;</w:t>
+        <w:br/>
+      </w:r>
+      <w:r>
+        <w:rPr>
+          <w:rFonts w:ascii="Times New Roman" w:hAnsi="Times New Roman" w:eastAsia="Times New Roman"/>
+          <w:b/>
+          <w:i/>
+          <w:sz w:val="30"/>
+        </w:rPr>
+        <w:t>công nghiệp vươn xa, Lào Cai bứt phá!”</w:t>
+      </w:r>
+    </w:p>
+    <w:p>
+      <w:pPr>
         <w:ind w:firstLine="720"/>
         <w:jc w:val="both"/>
       </w:pPr>
@@ -966,7 +991,7 @@
           <w:i w:val="0"/>
           <w:sz w:val="30"/>
         </w:rPr>
-        <w:t>Mặt bằng sạch đến đâu, nhà máy mọc lên đến đó. Sở Công Thương rất mong tiếp tục nhận được sự lãnh đạo, chỉ đạo của Thường trực Tỉnh ủy và sự phối hợp của các sở, ngành, địa phương. Xin trân trọng cảm ơn!</w:t>
+        <w:t>Với khẩu hiệu hành động đó, Sở Công Thương rất mong tiếp tục nhận được sự lãnh đạo, chỉ đạo của Thường trực Tỉnh ủy và sự phối hợp của các sở, ngành, địa phương. Xin trân trọng cảm ơn!</w:t>
       </w:r>
     </w:p>
     <w:sectPr>

</xml_diff>